<commit_message>
docs: add version number to business overview docx; archive old PDF
- Regenerated Grant-Pathway-Business-Overview.docx with 'Version 1.1'
  on the cover page (below the date, small italic grey text)
- Created docs/archive/ and moved the previous PDF
  (dated 15 April 2026) to docs/archive/Grant-Pathway-Business-Overview-v1.0.pdf
  using git mv to preserve history

Co-Authored-By: Claude Sonnet 4.6 <noreply@anthropic.com>
</commit_message>
<xml_diff>
--- a/docs/Grant-Pathway-Business-Overview.docx
+++ b/docs/Grant-Pathway-Business-Overview.docx
@@ -178,7 +178,7 @@
     </w:p>
     <w:p>
       <w:pPr>
-        <w:spacing w:before="160" w:after="0" w:lineRule="auto" w:line="240"/>
+        <w:spacing w:before="160" w:after="40" w:lineRule="auto" w:line="240"/>
         <w:jc w:val="center"/>
       </w:pPr>
       <w:r>
@@ -190,6 +190,22 @@
           <w:sz w:val="20"/>
         </w:rPr>
         <w:t>22 May 2026</w:t>
+      </w:r>
+    </w:p>
+    <w:p>
+      <w:pPr>
+        <w:spacing w:before="40" w:after="0" w:lineRule="auto" w:line="240"/>
+        <w:jc w:val="center"/>
+      </w:pPr>
+      <w:r>
+        <w:rPr>
+          <w:rFonts w:ascii="Calibri" w:hAnsi="Calibri"/>
+          <w:b w:val="0"/>
+          <w:i/>
+          <w:color w:val="555555"/>
+          <w:sz w:val="18"/>
+        </w:rPr>
+        <w:t>Version 1.1</w:t>
       </w:r>
     </w:p>
     <w:p>

</xml_diff>

<commit_message>
docs: add Grant Pathway logo and page numbering to Business Overview (v1.2)
Added the Grant Pathway logo to the cover page, enabled page numbering
on all body pages, and bumped the document version from 1.1 to 1.2.

Co-Authored-By: Claude Sonnet 4.6 <noreply@anthropic.com>
</commit_message>
<xml_diff>
--- a/docs/Grant-Pathway-Business-Overview.docx
+++ b/docs/Grant-Pathway-Business-Overview.docx
@@ -62,8 +62,43 @@
     </w:p>
     <w:p>
       <w:pPr>
-        <w:spacing w:before="0" w:after="0"/>
+        <w:spacing w:before="200" w:after="120" w:lineRule="auto" w:line="240"/>
+        <w:jc w:val="center"/>
       </w:pPr>
+      <w:r>
+        <w:drawing>
+          <wp:inline xmlns:a="http://schemas.openxmlformats.org/drawingml/2006/main" xmlns:pic="http://schemas.openxmlformats.org/drawingml/2006/picture">
+            <wp:extent cx="2286000" cy="1287000"/>
+            <wp:docPr id="2" name="Grant Pathway Logo"/>
+            <wp:cNvGraphicFramePr>
+              <a:graphicFrameLocks noChangeAspect="1"/>
+            </wp:cNvGraphicFramePr>
+            <a:graphic>
+              <a:graphicData uri="http://schemas.openxmlformats.org/drawingml/2006/picture">
+                <pic:pic>
+                  <pic:nvPicPr>
+                    <pic:cNvPr id="3" name="Grant Pathway PNG Logo"/>
+                    <pic:cNvPicPr/>
+                  </pic:nvPicPr>
+                  <pic:blipFill>
+                    <a:blip r:embed="rId12"/>
+                    <a:stretch>
+                      <a:fillRect/>
+                    </a:stretch>
+                  </pic:blipFill>
+                  <pic:spPr>
+                    <a:xfrm>
+                      <a:off x="0" y="0"/>
+                      <a:ext cx="2286000" cy="1287000"/>
+                    </a:xfrm>
+                    <a:prstGeom prst="rect"/>
+                  </pic:spPr>
+                </pic:pic>
+              </a:graphicData>
+            </a:graphic>
+          </wp:inline>
+        </w:drawing>
+      </w:r>
     </w:p>
     <w:p>
       <w:pPr>
@@ -205,7 +240,7 @@
           <w:color w:val="555555"/>
           <w:sz w:val="18"/>
         </w:rPr>
-        <w:t>Version 1.1</w:t>
+        <w:t>Version 1.2</w:t>
       </w:r>
     </w:p>
     <w:p>
@@ -1086,7 +1121,6 @@
       <w:pgSz w:w="11906" w:h="16838"/>
       <w:pgMar w:top="1020" w:right="1417" w:bottom="1134" w:left="1417" w:header="454" w:footer="567" w:gutter="0"/>
       <w:cols w:space="720"/>
-      <w:titlePg/>
       <w:docGrid w:linePitch="360"/>
     </w:sectPr>
   </w:body>

</xml_diff>

<commit_message>
docs: fix cover logo and footer page numbering in Business Overview (v1.3)
Replace transparent logo with Grant Pathway PNG Logo from docs folder,
increase logo size to 3 inches wide, and update footer to show
'Free for UK charities | Page n of n | grantpathway.org.uk'
with correct tab stops and proper OOXML field structure.

Co-Authored-By: Claude Sonnet 4.6 <noreply@anthropic.com>
</commit_message>
<xml_diff>
--- a/docs/Grant-Pathway-Business-Overview.docx
+++ b/docs/Grant-Pathway-Business-Overview.docx
@@ -68,7 +68,7 @@
       <w:r>
         <w:drawing>
           <wp:inline xmlns:a="http://schemas.openxmlformats.org/drawingml/2006/main" xmlns:pic="http://schemas.openxmlformats.org/drawingml/2006/picture">
-            <wp:extent cx="2286000" cy="1287000"/>
+            <wp:extent cx="2743200" cy="1543050"/>
             <wp:docPr id="2" name="Grant Pathway Logo"/>
             <wp:cNvGraphicFramePr>
               <a:graphicFrameLocks noChangeAspect="1"/>
@@ -89,7 +89,7 @@
                   <pic:spPr>
                     <a:xfrm>
                       <a:off x="0" y="0"/>
-                      <a:ext cx="2286000" cy="1287000"/>
+                      <a:ext cx="2743200" cy="1543050"/>
                     </a:xfrm>
                     <a:prstGeom prst="rect"/>
                   </pic:spPr>
@@ -240,7 +240,7 @@
           <w:color w:val="555555"/>
           <w:sz w:val="18"/>
         </w:rPr>
-        <w:t>Version 1.2</w:t>
+        <w:t>Version 1.3</w:t>
       </w:r>
     </w:p>
     <w:p>
@@ -1152,9 +1152,6 @@
       <w:t>Free for UK charities</w:t>
     </w:r>
     <w:r>
-      <w:tab/>
-    </w:r>
-    <w:r>
       <w:rPr>
         <w:rFonts w:ascii="Calibri" w:hAnsi="Calibri"/>
         <w:b w:val="0"/>
@@ -1162,11 +1159,96 @@
         <w:color w:val="555555"/>
         <w:sz w:val="18"/>
       </w:rPr>
+      <w:tab/>
+    </w:r>
+    <w:r>
+      <w:rPr>
+        <w:rFonts w:ascii="Calibri" w:hAnsi="Calibri"/>
+        <w:b w:val="0"/>
+        <w:i/>
+        <w:color w:val="555555"/>
+        <w:sz w:val="18"/>
+      </w:rPr>
+      <w:t xml:space="preserve">Page </w:t>
+    </w:r>
+    <w:r>
+      <w:rPr>
+        <w:rFonts w:ascii="Calibri" w:hAnsi="Calibri"/>
+        <w:b w:val="0"/>
+        <w:i/>
+        <w:color w:val="555555"/>
+        <w:sz w:val="18"/>
+      </w:rPr>
       <w:fldChar w:fldCharType="begin"/>
-      <w:instrText> PAGE </w:instrText>
+    </w:r>
+    <w:r>
+      <w:rPr>
+        <w:rFonts w:ascii="Calibri" w:hAnsi="Calibri"/>
+        <w:b w:val="0"/>
+        <w:i/>
+        <w:color w:val="555555"/>
+        <w:sz w:val="18"/>
+      </w:rPr>
+      <w:instrText xml:space="preserve"> PAGE </w:instrText>
+    </w:r>
+    <w:r>
+      <w:rPr>
+        <w:rFonts w:ascii="Calibri" w:hAnsi="Calibri"/>
+        <w:b w:val="0"/>
+        <w:i/>
+        <w:color w:val="555555"/>
+        <w:sz w:val="18"/>
+      </w:rPr>
       <w:fldChar w:fldCharType="end"/>
     </w:r>
     <w:r>
+      <w:rPr>
+        <w:rFonts w:ascii="Calibri" w:hAnsi="Calibri"/>
+        <w:b w:val="0"/>
+        <w:i/>
+        <w:color w:val="555555"/>
+        <w:sz w:val="18"/>
+      </w:rPr>
+      <w:t xml:space="preserve"> of </w:t>
+    </w:r>
+    <w:r>
+      <w:rPr>
+        <w:rFonts w:ascii="Calibri" w:hAnsi="Calibri"/>
+        <w:b w:val="0"/>
+        <w:i/>
+        <w:color w:val="555555"/>
+        <w:sz w:val="18"/>
+      </w:rPr>
+      <w:fldChar w:fldCharType="begin"/>
+    </w:r>
+    <w:r>
+      <w:rPr>
+        <w:rFonts w:ascii="Calibri" w:hAnsi="Calibri"/>
+        <w:b w:val="0"/>
+        <w:i/>
+        <w:color w:val="555555"/>
+        <w:sz w:val="18"/>
+      </w:rPr>
+      <w:instrText xml:space="preserve"> NUMPAGES </w:instrText>
+    </w:r>
+    <w:r>
+      <w:rPr>
+        <w:rFonts w:ascii="Calibri" w:hAnsi="Calibri"/>
+        <w:b w:val="0"/>
+        <w:i/>
+        <w:color w:val="555555"/>
+        <w:sz w:val="18"/>
+      </w:rPr>
+      <w:fldChar w:fldCharType="end"/>
+    </w:r>
+    <w:r>
+      <w:rPr>
+        <w:rFonts w:ascii="Calibri" w:hAnsi="Calibri"/>
+        <w:b w:val="0"/>
+        <w:i/>
+        <w:color w:val="555555"/>
+        <w:sz w:val="18"/>
+      </w:rPr>
       <w:tab/>
     </w:r>
     <w:r>

</xml_diff>